<commit_message>
docs: bring How-to-create-plugins.docx in line with PLUGINS.md
The Word copy of the plugin guide had drifted from PLUGINS.md:
- ctx table: API 2, ctx.ask added, removed findings helpers dropped
- "What a plugin may add": pull-not-push costs, model_facing, the pull
  menu and USE:, replacing "~40 tokens every turn, forever"
- "Worked example": the arwPyFormat, arwRunTests and arwLint repos, with
  links, replacing tools/linuxrebel/... folders that no longer ship

Each section was rebuilt from PLUGINS.md in the document's existing
pandoc styles; the rest of the file is unchanged.

Co-Authored-By: Claude Opus 5.5 <noreply@anthropic.com>
</commit_message>
<xml_diff>
--- a/How-to-create-plugins.docx
+++ b/How-to-create-plugins.docx
@@ -2126,7 +2126,7 @@
         <w:rPr>
           <w:rStyle w:val="VerbatimChar"/>
         </w:rPr>
-        <w:t xml:space="preserve">ctx.api             int, currently 1. Bumped on a breaking change.</w:t>
+        <w:t xml:space="preserve">ctx.api             int, currently 2. Bumped on a breaking change.</w:t>
       </w:r>
       <w:r>
         <w:br/>
@@ -2195,6 +2195,45 @@
         <w:rPr>
           <w:rStyle w:val="VerbatimChar"/>
         </w:rPr>
+        <w:t xml:space="preserve">model</w:t>
+      </w:r>
+      <w:r>
+        <w:br/>
+      </w:r>
+      <w:r>
+        <w:rPr>
+          <w:rStyle w:val="VerbatimChar"/>
+        </w:rPr>
+        <w:t xml:space="preserve">ctx.ask(messages, max_tokens=300, send_tools=False, no_think=False) -&gt; str</w:t>
+      </w:r>
+      <w:r>
+        <w:br/>
+      </w:r>
+      <w:r>
+        <w:rPr>
+          <w:rStyle w:val="VerbatimChar"/>
+        </w:rPr>
+        <w:t xml:space="preserve">                    one model call with the harness's trimming and error</w:t>
+      </w:r>
+      <w:r>
+        <w:br/>
+      </w:r>
+      <w:r>
+        <w:rPr>
+          <w:rStyle w:val="VerbatimChar"/>
+        </w:rPr>
+        <w:t xml:space="preserve">                    handling, on the session's model. No prompt of its own.</w:t>
+      </w:r>
+      <w:r>
+        <w:br/>
+      </w:r>
+      <w:r>
+        <w:br/>
+      </w:r>
+      <w:r>
+        <w:rPr>
+          <w:rStyle w:val="VerbatimChar"/>
+        </w:rPr>
         <w:t xml:space="preserve">paths and writing</w:t>
       </w:r>
       <w:r>
@@ -2223,81 +2262,6 @@
           <w:rStyle w:val="VerbatimChar"/>
         </w:rPr>
         <w:t xml:space="preserve">ctx.write_denied(p) -&gt; the standard refusal dict</w:t>
-      </w:r>
-      <w:r>
-        <w:br/>
-      </w:r>
-      <w:r>
-        <w:br/>
-      </w:r>
-      <w:r>
-        <w:rPr>
-          <w:rStyle w:val="VerbatimChar"/>
-        </w:rPr>
-        <w:t xml:space="preserve">findings pipeline</w:t>
-      </w:r>
-      <w:r>
-        <w:br/>
-      </w:r>
-      <w:r>
-        <w:rPr>
-          <w:rStyle w:val="VerbatimChar"/>
-        </w:rPr>
-        <w:t xml:space="preserve">ctx.gather_findings(target, only="")     flatten a detector's output</w:t>
-      </w:r>
-      <w:r>
-        <w:br/>
-      </w:r>
-      <w:r>
-        <w:rPr>
-          <w:rStyle w:val="VerbatimChar"/>
-        </w:rPr>
-        <w:t xml:space="preserve">ctx.propose_fix(model, cfg, layers, lines, finding)</w:t>
-      </w:r>
-      <w:r>
-        <w:br/>
-      </w:r>
-      <w:r>
-        <w:rPr>
-          <w:rStyle w:val="VerbatimChar"/>
-        </w:rPr>
-        <w:t xml:space="preserve">                                          computed when determined, else asks</w:t>
-      </w:r>
-      <w:r>
-        <w:br/>
-      </w:r>
-      <w:r>
-        <w:rPr>
-          <w:rStyle w:val="VerbatimChar"/>
-        </w:rPr>
-        <w:t xml:space="preserve">ctx.apply_fix(path, lines, finding, new) replace / insert / write, checked</w:t>
-      </w:r>
-      <w:r>
-        <w:br/>
-      </w:r>
-      <w:r>
-        <w:rPr>
-          <w:rStyle w:val="VerbatimChar"/>
-        </w:rPr>
-        <w:t xml:space="preserve">ctx.finish_run(path, snapshot) -&gt; bool   revert the run if it broke the file</w:t>
-      </w:r>
-      <w:r>
-        <w:br/>
-      </w:r>
-      <w:r>
-        <w:rPr>
-          <w:rStyle w:val="VerbatimChar"/>
-        </w:rPr>
-        <w:t xml:space="preserve">ctx.defer(target, finding)               append to DEBT.md</w:t>
-      </w:r>
-      <w:r>
-        <w:br/>
-      </w:r>
-      <w:r>
-        <w:rPr>
-          <w:rStyle w:val="VerbatimChar"/>
-        </w:rPr>
-        <w:t xml:space="preserve">ctx.debt_file                            the ledger's filename</w:t>
       </w:r>
       <w:r>
         <w:br/>
@@ -2849,10 +2813,7 @@
               <w:t xml:space="preserve">nothing</w:t>
             </w:r>
             <w:r>
-              <w:t xml:space="preserve"> </w:t>
-            </w:r>
-            <w:r>
-              <w:t xml:space="preserve">until you invoke it</w:t>
+              <w:t xml:space="preserve"> until you invoke it</w:t>
             </w:r>
           </w:p>
         </w:tc>
@@ -2876,7 +2837,44 @@
               <w:pStyle w:val="Compact"/>
             </w:pPr>
             <w:r>
-              <w:t xml:space="preserve">~40 tokens in the system prompt, every turn, forever</w:t>
+              <w:rPr>
+                <w:b/>
+                <w:bCs/>
+              </w:rPr>
+              <w:t xml:space="preserve">nothing</w:t>
+            </w:r>
+            <w:r>
+              <w:t xml:space="preserve"> until you advertise it</w:t>
+            </w:r>
+          </w:p>
+        </w:tc>
+      </w:tr>
+      <w:tr>
+        <w:tc>
+          <w:tcPr/>
+          <w:p>
+            <w:pPr>
+              <w:pStyle w:val="Compact"/>
+            </w:pPr>
+            <w:r>
+              <w:t xml:space="preserve">a tool with </w:t>
+            </w:r>
+            <w:r>
+              <w:rPr>
+                <w:rStyle w:val="VerbatimChar"/>
+              </w:rPr>
+              <w:t xml:space="preserve">model_facing = True</w:t>
+            </w:r>
+          </w:p>
+        </w:tc>
+        <w:tc>
+          <w:tcPr/>
+          <w:p>
+            <w:pPr>
+              <w:pStyle w:val="Compact"/>
+            </w:pPr>
+            <w:r>
+              <w:t xml:space="preserve">its name + one-line description in the pull menu every turn (~15 tokens); the full ~40-token schema only on a turn the model pulls it</w:t>
             </w:r>
           </w:p>
         </w:tc>
@@ -2911,16 +2909,7 @@
         <w:pStyle w:val="BodyText"/>
       </w:pPr>
       <w:r>
-        <w:t xml:space="preserve">Commands are free because nothing about them reaches the model until you type</w:t>
-      </w:r>
-      <w:r>
-        <w:t xml:space="preserve"> </w:t>
-      </w:r>
-      <w:r>
-        <w:t xml:space="preserve">one. That is why</w:t>
-      </w:r>
-      <w:r>
-        <w:t xml:space="preserve"> </w:t>
+        <w:t xml:space="preserve">Commands are free because nothing about them reaches the model until you type one. That is why </w:t>
       </w:r>
       <w:r>
         <w:rPr>
@@ -2929,16 +2918,7 @@
         <w:t xml:space="preserve">/lint</w:t>
       </w:r>
       <w:r>
-        <w:t xml:space="preserve"> </w:t>
-      </w:r>
-      <w:r>
-        <w:t xml:space="preserve">can afford a 90-line loop and long per-finding</w:t>
-      </w:r>
-      <w:r>
-        <w:t xml:space="preserve"> </w:t>
-      </w:r>
-      <w:r>
-        <w:t xml:space="preserve">explanations: none of it is paid for unless used.</w:t>
+        <w:t xml:space="preserve"> can afford a 90-line loop and long per-finding explanations: none of it is paid for unless used.</w:t>
       </w:r>
     </w:p>
     <w:p>
@@ -2946,49 +2926,251 @@
         <w:pStyle w:val="BodyText"/>
       </w:pPr>
       <w:r>
-        <w:t xml:space="preserve">Tools are not free. Twenty plugins each adding "just one tool" is 800 tokens</w:t>
-      </w:r>
-      <w:r>
-        <w:t xml:space="preserve"> </w:t>
-      </w:r>
-      <w:r>
-        <w:t xml:space="preserve">off a 2048-token window before you have typed anything. Add a tool only when</w:t>
-      </w:r>
-      <w:r>
-        <w:t xml:space="preserve"> </w:t>
-      </w:r>
-      <w:r>
-        <w:t xml:space="preserve">the model genuinely needs to call it; otherwise write a command.</w:t>
-      </w:r>
-    </w:p>
-    <w:p>
-      <w:pPr>
-        <w:pStyle w:val="BodyText"/>
-      </w:pPr>
+        <w:t xml:space="preserve">Plugin tools are free for the same reason, by default. A registered tool is always </w:t>
+      </w:r>
       <w:r>
         <w:rPr>
           <w:b/>
           <w:bCs/>
         </w:rPr>
+        <w:t xml:space="preserve">callable</w:t>
+      </w:r>
+      <w:r>
+        <w:t xml:space="preserve"> — </w:t>
+      </w:r>
+      <w:r>
+        <w:rPr>
+          <w:rStyle w:val="VerbatimChar"/>
+        </w:rPr>
+        <w:t xml:space="preserve">/your_tool arg</w:t>
+      </w:r>
+      <w:r>
+        <w:t xml:space="preserve"> works, and the model can call it if it knows the name — but it is not </w:t>
+      </w:r>
+      <w:r>
+        <w:rPr>
+          <w:b/>
+          <w:bCs/>
+        </w:rPr>
+        <w:t xml:space="preserve">advertised</w:t>
+      </w:r>
+      <w:r>
+        <w:t xml:space="preserve"> unless it says so. Tools are </w:t>
+      </w:r>
+      <w:r>
+        <w:rPr>
+          <w:b/>
+          <w:bCs/>
+        </w:rPr>
+        <w:t xml:space="preserve">pulled, not pushed</w:t>
+      </w:r>
+      <w:r>
+        <w:t xml:space="preserve">: a turn's first model call sends only tool </w:t>
+      </w:r>
+      <w:r>
+        <w:rPr>
+          <w:i/>
+          <w:iCs/>
+        </w:rPr>
+        <w:t xml:space="preserve">names</w:t>
+      </w:r>
+      <w:r>
+        <w:t xml:space="preserve"> and one-line descriptions (the pull menu). </w:t>
+      </w:r>
+      <w:r>
+        <w:rPr>
+          <w:rStyle w:val="VerbatimChar"/>
+        </w:rPr>
+        <w:t xml:space="preserve">model_facing = True</w:t>
+      </w:r>
+      <w:r>
+        <w:t xml:space="preserve"> puts a tool in that menu; its full signature-and-docstring schema is sent only on the second call of a turn where the model asks for it with </w:t>
+      </w:r>
+      <w:r>
+        <w:rPr>
+          <w:rStyle w:val="VerbatimChar"/>
+        </w:rPr>
+        <w:t xml:space="preserve">USE: &lt;tool&gt;</w:t>
+      </w:r>
+      <w:r>
+        <w:t xml:space="preserve">. So a model-facing tool the model does not reach for costs only its one line, not its full schema.</w:t>
+      </w:r>
+    </w:p>
+    <w:p>
+      <w:pPr>
+        <w:pStyle w:val="SourceCode"/>
+      </w:pPr>
+      <w:r>
+        <w:rPr>
+          <w:rStyle w:val="KeywordTok"/>
+        </w:rPr>
+        <w:t xml:space="preserve">def</w:t>
+      </w:r>
+      <w:r>
+        <w:rPr>
+          <w:rStyle w:val="NormalTok"/>
+        </w:rPr>
+        <w:t xml:space="preserve"> your_tool(path: </w:t>
+      </w:r>
+      <w:r>
+        <w:rPr>
+          <w:rStyle w:val="BuiltInTok"/>
+        </w:rPr>
+        <w:t xml:space="preserve">str</w:t>
+      </w:r>
+      <w:r>
+        <w:rPr>
+          <w:rStyle w:val="NormalTok"/>
+        </w:rPr>
+        <w:t xml:space="preserve">) </w:t>
+      </w:r>
+      <w:r>
+        <w:rPr>
+          <w:rStyle w:val="OperatorTok"/>
+        </w:rPr>
+        <w:t xml:space="preserve">-&gt;</w:t>
+      </w:r>
+      <w:r>
+        <w:rPr>
+          <w:rStyle w:val="NormalTok"/>
+        </w:rPr>
+        <w:t xml:space="preserve"> </w:t>
+      </w:r>
+      <w:r>
+        <w:rPr>
+          <w:rStyle w:val="BuiltInTok"/>
+        </w:rPr>
+        <w:t xml:space="preserve">dict</w:t>
+      </w:r>
+      <w:r>
+        <w:rPr>
+          <w:rStyle w:val="NormalTok"/>
+        </w:rPr>
+        <w:t xml:space="preserve">:</w:t>
+      </w:r>
+      <w:r>
+        <w:br/>
+      </w:r>
+      <w:r>
+        <w:rPr>
+          <w:rStyle w:val="NormalTok"/>
+        </w:rPr>
+        <w:t xml:space="preserve">    </w:t>
+      </w:r>
+      <w:r>
+        <w:rPr>
+          <w:rStyle w:val="CommentTok"/>
+        </w:rPr>
+        <w:t xml:space="preserve">"""One short line. This is what the model reads."""</w:t>
+      </w:r>
+      <w:r>
+        <w:br/>
+      </w:r>
+      <w:r>
+        <w:rPr>
+          <w:rStyle w:val="NormalTok"/>
+        </w:rPr>
+        <w:t xml:space="preserve">    ...</w:t>
+      </w:r>
+      <w:r>
+        <w:br/>
+      </w:r>
+      <w:r>
+        <w:br/>
+      </w:r>
+      <w:r>
+        <w:rPr>
+          <w:rStyle w:val="NormalTok"/>
+        </w:rPr>
+        <w:t xml:space="preserve">your_tool.model_facing </w:t>
+      </w:r>
+      <w:r>
+        <w:rPr>
+          <w:rStyle w:val="OperatorTok"/>
+        </w:rPr>
+        <w:t xml:space="preserve">=</w:t>
+      </w:r>
+      <w:r>
+        <w:rPr>
+          <w:rStyle w:val="NormalTok"/>
+        </w:rPr>
+        <w:t xml:space="preserve"> </w:t>
+      </w:r>
+      <w:r>
+        <w:rPr>
+          <w:rStyle w:val="BuiltInTok"/>
+        </w:rPr>
+        <w:t xml:space="preserve">True</w:t>
+      </w:r>
+      <w:r>
+        <w:rPr>
+          <w:rStyle w:val="NormalTok"/>
+        </w:rPr>
+        <w:t xml:space="preserve">   </w:t>
+      </w:r>
+      <w:r>
+        <w:rPr>
+          <w:rStyle w:val="CommentTok"/>
+        </w:rPr>
+        <w:t xml:space="preserve"># show in the pull menu; full schema only when pulled</w:t>
+      </w:r>
+    </w:p>
+    <w:p>
+      <w:pPr>
+        <w:pStyle w:val="BodyText"/>
+      </w:pPr>
+      <w:r>
+        <w:t xml:space="preserve">Set it only when the model must reach for the tool unprompted to do its job. Every model-facing tool is one more name in every pull menu, so twenty of them still crowd a 2048-token window before you have typed anything. If the user is the one deciding when to run it — lint this file, run the tests — leave it unadvertised, or write a command instead.</w:t>
+      </w:r>
+    </w:p>
+    <w:p>
+      <w:pPr>
+        <w:pStyle w:val="BodyText"/>
+      </w:pPr>
+      <w:r>
+        <w:t xml:space="preserve">Either way the user has the final say per session: </w:t>
+      </w:r>
+      <w:r>
+        <w:rPr>
+          <w:rStyle w:val="VerbatimChar"/>
+        </w:rPr>
+        <w:t xml:space="preserve">/tools on &lt;name&gt;</w:t>
+      </w:r>
+      <w:r>
+        <w:t xml:space="preserve"> and </w:t>
+      </w:r>
+      <w:r>
+        <w:rPr>
+          <w:rStyle w:val="VerbatimChar"/>
+        </w:rPr>
+        <w:t xml:space="preserve">/tools off &lt;name&gt;</w:t>
+      </w:r>
+      <w:r>
+        <w:t xml:space="preserve">, and </w:t>
+      </w:r>
+      <w:r>
+        <w:rPr>
+          <w:rStyle w:val="VerbatimChar"/>
+        </w:rPr>
+        <w:t xml:space="preserve">/tools</w:t>
+      </w:r>
+      <w:r>
+        <w:t xml:space="preserve"> shows the current bill.</w:t>
+      </w:r>
+    </w:p>
+    <w:p>
+      <w:pPr>
+        <w:pStyle w:val="BodyText"/>
+      </w:pPr>
+      <w:r>
+        <w:rPr>
+          <w:b/>
+          <w:bCs/>
+        </w:rPr>
         <w:t xml:space="preserve">Plugins cannot add system prompt text.</w:t>
       </w:r>
       <w:r>
-        <w:t xml:space="preserve"> </w:t>
-      </w:r>
-      <w:r>
-        <w:t xml:space="preserve">There is no hook for it, by design.</w:t>
-      </w:r>
-      <w:r>
-        <w:t xml:space="preserve"> </w:t>
-      </w:r>
-      <w:r>
-        <w:t xml:space="preserve">A plugin adding standing instructions would alter every future turn,</w:t>
-      </w:r>
-      <w:r>
-        <w:t xml:space="preserve"> </w:t>
-      </w:r>
-      <w:r>
-        <w:t xml:space="preserve">invisibly and permanently — a much worse failure than any one-off action.</w:t>
+        <w:t xml:space="preserve"> There is no hook for it, by design. A plugin adding standing instructions would alter every future turn, invisibly and permanently — a much worse failure than any one-off action.</w:t>
       </w:r>
     </w:p>
     <w:p>
@@ -2996,19 +3178,7 @@
         <w:pStyle w:val="BodyText"/>
       </w:pPr>
       <w:r>
-        <w:t xml:space="preserve">Your tool's docstring is the one exception, since it must reach the model to be</w:t>
-      </w:r>
-      <w:r>
-        <w:t xml:space="preserve"> </w:t>
-      </w:r>
-      <w:r>
-        <w:t xml:space="preserve">callable. It is capped at 240 characters, flattened to a single line, and</w:t>
-      </w:r>
-      <w:r>
-        <w:t xml:space="preserve"> </w:t>
-      </w:r>
-      <w:r>
-        <w:t xml:space="preserve">stripped of control characters. Write a short, plain description.</w:t>
+        <w:t xml:space="preserve">Your tool's docstring is the one exception, since a model-facing tool has to describe itself to be used. It is capped at 240 characters, flattened to a single line, and stripped of control characters. Write a short, plain description.</w:t>
       </w:r>
     </w:p>
     <w:p>
@@ -3314,19 +3484,25 @@
         <w:pStyle w:val="FirstParagraph"/>
       </w:pPr>
       <w:r>
-        <w:rPr>
-          <w:rStyle w:val="VerbatimChar"/>
-        </w:rPr>
-        <w:t xml:space="preserve">tools/linuxrebel/format/</w:t>
-      </w:r>
-      <w:r>
-        <w:t xml:space="preserve"> </w:t>
-      </w:r>
-      <w:r>
-        <w:t xml:space="preserve">is the smallest complete plugin: one tool, a</w:t>
-      </w:r>
-      <w:r>
-        <w:t xml:space="preserve"> </w:t>
+        <w:t xml:space="preserve">No plugins ship with the agent, so the examples are repos you can read:</w:t>
+      </w:r>
+    </w:p>
+    <w:p>
+      <w:pPr>
+        <w:pStyle w:val="BodyText"/>
+      </w:pPr>
+      <w:hyperlink r:id="rId101">
+        <w:r>
+          <w:rPr>
+            <w:rStyle w:val="Hyperlink"/>
+            <w:b/>
+            <w:bCs/>
+          </w:rPr>
+          <w:t xml:space="preserve">arwPyFormat</w:t>
+        </w:r>
+      </w:hyperlink>
+      <w:r>
+        <w:t xml:space="preserve"> is the smallest complete plugin: one tool, a </w:t>
       </w:r>
       <w:r>
         <w:rPr>
@@ -3335,30 +3511,25 @@
         <w:t xml:space="preserve">REQUIRES</w:t>
       </w:r>
       <w:r>
-        <w:t xml:space="preserve"> </w:t>
-      </w:r>
-      <w:r>
-        <w:t xml:space="preserve">block, a clear error when autopep8 is absent, and no command.</w:t>
+        <w:t xml:space="preserve"> block, a clear error when autopep8 is absent, and no command. Around 50 lines.</w:t>
       </w:r>
     </w:p>
     <w:p>
       <w:pPr>
         <w:pStyle w:val="BodyText"/>
       </w:pPr>
-      <w:r>
-        <w:rPr>
-          <w:rStyle w:val="VerbatimChar"/>
-        </w:rPr>
-        <w:t xml:space="preserve">tools/linuxrebel/lint/</w:t>
-      </w:r>
-      <w:r>
-        <w:t xml:space="preserve"> </w:t>
-      </w:r>
-      <w:r>
-        <w:t xml:space="preserve">is the full shape: a tool, a gated command,</w:t>
-      </w:r>
-      <w:r>
-        <w:t xml:space="preserve"> </w:t>
+      <w:hyperlink r:id="rId102">
+        <w:r>
+          <w:rPr>
+            <w:rStyle w:val="Hyperlink"/>
+            <w:b/>
+            <w:bCs/>
+          </w:rPr>
+          <w:t xml:space="preserve">arwRunTests</w:t>
+        </w:r>
+      </w:hyperlink>
+      <w:r>
+        <w:t xml:space="preserve"> is the middle shape: a tool, a gated command with </w:t>
       </w:r>
       <w:r>
         <w:rPr>
@@ -3367,19 +3538,43 @@
         <w:t xml:space="preserve">help</w:t>
       </w:r>
       <w:r>
-        <w:t xml:space="preserve">, plain</w:t>
-      </w:r>
-      <w:r>
-        <w:t xml:space="preserve"> </w:t>
-      </w:r>
-      <w:r>
-        <w:t xml:space="preserve">English translation of a detector's messages, and per-finding classification of</w:t>
-      </w:r>
-      <w:r>
-        <w:t xml:space="preserve"> </w:t>
-      </w:r>
-      <w:r>
-        <w:t xml:space="preserve">how a fix can be applied.</w:t>
+        <w:t xml:space="preserve">, its own state file in </w:t>
+      </w:r>
+      <w:r>
+        <w:rPr>
+          <w:rStyle w:val="VerbatimChar"/>
+        </w:rPr>
+        <w:t xml:space="preserve">PLUGIN_DIR</w:t>
+      </w:r>
+      <w:r>
+        <w:t xml:space="preserve">, and a self-check under </w:t>
+      </w:r>
+      <w:r>
+        <w:rPr>
+          <w:rStyle w:val="VerbatimChar"/>
+        </w:rPr>
+        <w:t xml:space="preserve">__main__</w:t>
+      </w:r>
+      <w:r>
+        <w:t xml:space="preserve">.</w:t>
+      </w:r>
+    </w:p>
+    <w:p>
+      <w:pPr>
+        <w:pStyle w:val="BodyText"/>
+      </w:pPr>
+      <w:hyperlink r:id="rId103">
+        <w:r>
+          <w:rPr>
+            <w:rStyle w:val="Hyperlink"/>
+            <w:b/>
+            <w:bCs/>
+          </w:rPr>
+          <w:t xml:space="preserve">arwLint</w:t>
+        </w:r>
+      </w:hyperlink>
+      <w:r>
+        <w:t xml:space="preserve"> is the full shape: plain English translation of a detector's messages, per-finding classification of how a fix can be applied, and a run it reverts if the result stops compiling.</w:t>
       </w:r>
     </w:p>
     <w:bookmarkEnd w:id="21"/>

</xml_diff>